<commit_message>
HG7 Bloque II: correcciones puntuales de la revisión del 15/10/2026
- A19 (Clase 10): el segundo fragmento de la Real Provisión no reproducía
  la edición de Rivarola Paoli. Se declara como adaptación escolar (no cita
  literal) y se elimina la afirmación «con su ortografía»; ajuste en la
  síntesis de la Continuación D.
- Clase 9: levantamientos de Aracaré y Tabaré en 1542-1543 (Tabaré, 1543),
  con referencia a Roulet; variante Oberá/Overá.
- Bloque I: comparación píxel a píxel de los cinco mapas regenerados con
  sus versiones de 755d7ad (solo cambia el rótulo intermedio de la escala).
- Bloque II reconstruido: paginación sin cambios; 1655 controles, 0 fallos.
  Correcciones documentadas en INFORME_BLOQUE_II §7 y CONDICIONES.

Co-Authored-By: Claude Opus 5.5 <noreply@anthropic.com>
Claude-Session: https://claude.ai/code/session_01LqBrALZn8HbnzzUtvCFRMa
</commit_message>
<xml_diff>
--- a/historia_geografia_7/05_produccion_anual/bloque_2/planes/PLANES_BLOQUE_II_A4.docx
+++ b/historia_geografia_7/05_produccion_anual/bloque_2/planes/PLANES_BLOQUE_II_A4.docx
@@ -9531,7 +9531,7 @@
         <w:pStyle w:val="ListBullet"/>
       </w:pPr>
       <w:r>
-        <w:t>Las fechas de las rebeliones de Tabaré y de Oberá son las habituales en la bibliografía; el tomo las da como aproximadas («hacia 1542»).</w:t>
+        <w:t>Levantamientos de Aracaré y Tabaré: 1542-1543; la rebelión de Tabaré se fecha en 1543 (Roulet). Oberá y Overá son variantes del mismo nombre en la bibliografía.</w:t>
       </w:r>
     </w:p>
     <w:p>
@@ -11500,7 +11500,7 @@
         <w:pStyle w:val="ListBullet"/>
       </w:pPr>
       <w:r>
-        <w:t>Los dos fragmentos vienen de la transcripción de Rivarola Paoli, con su ortografía. Sobre 1539, el tomo presenta el debate sin tomar partido: no afirmar que hubo una elección.</w:t>
+        <w:t>Los dos fragmentos vienen de la transcripción de Rivarola Paoli; el segundo es una adaptación escolar declarada en el tomo (no es cita literal). Sobre 1539, el tomo presenta el debate sin tomar partido: no afirmar que hubo una elección.</w:t>
       </w:r>
     </w:p>
     <w:p>

</xml_diff>